<commit_message>
Add required plugininfo class for coursectrlmod subplugin type
</commit_message>
<xml_diff>
--- a/docs/Pflichten- und Lastenheft.docx
+++ b/docs/Pflichten- und Lastenheft.docx
@@ -175,7 +175,7 @@
         <w:rPr>
           <w:lang w:val="en-US"/>
         </w:rPr>
-        <w:t>coursectrl_mod</w:t>
+        <w:t>coursectrlmod</w:t>
       </w:r>
       <w:proofErr w:type="spellEnd"/>
     </w:p>
@@ -226,7 +226,7 @@
       </w:pPr>
       <w:proofErr w:type="spellStart"/>
       <w:r>
-        <w:t>coursectrl_mod_assign</w:t>
+        <w:t>coursectrlmod_assign</w:t>
       </w:r>
       <w:proofErr w:type="spellEnd"/>
     </w:p>
@@ -239,7 +239,7 @@
       </w:pPr>
       <w:proofErr w:type="spellStart"/>
       <w:r>
-        <w:t>coursectrl_mod_quiz</w:t>
+        <w:t>coursectrlmod_quiz</w:t>
       </w:r>
       <w:proofErr w:type="spellEnd"/>
     </w:p>
@@ -252,7 +252,7 @@
       </w:pPr>
       <w:proofErr w:type="spellStart"/>
       <w:r>
-        <w:t>coursectrl_mod_lesson</w:t>
+        <w:t>coursectrlmod_lesson</w:t>
       </w:r>
       <w:proofErr w:type="spellEnd"/>
     </w:p>
@@ -265,7 +265,7 @@
       </w:pPr>
       <w:proofErr w:type="spellStart"/>
       <w:r>
-        <w:t>coursectrl_mod_page</w:t>
+        <w:t>coursectrlmod_page</w:t>
       </w:r>
       <w:proofErr w:type="spellEnd"/>
     </w:p>
@@ -278,7 +278,7 @@
       </w:pPr>
       <w:proofErr w:type="spellStart"/>
       <w:r>
-        <w:t>coursectrl_mod_feedback</w:t>
+        <w:t>coursectrlmod_feedback</w:t>
       </w:r>
       <w:proofErr w:type="spellEnd"/>
     </w:p>
@@ -291,7 +291,7 @@
       </w:pPr>
       <w:proofErr w:type="spellStart"/>
       <w:r>
-        <w:t>coursectrl_mod_forum</w:t>
+        <w:t>coursectrlmod_forum</w:t>
       </w:r>
       <w:proofErr w:type="spellEnd"/>
     </w:p>
@@ -304,7 +304,7 @@
       </w:pPr>
       <w:proofErr w:type="spellStart"/>
       <w:r>
-        <w:t>coursectrl_mod_workshop</w:t>
+        <w:t>coursectrlmod_workshop</w:t>
       </w:r>
       <w:proofErr w:type="spellEnd"/>
     </w:p>
@@ -316,7 +316,7 @@
         </w:numPr>
       </w:pPr>
       <w:r>
-        <w:t>coursectrl_mod_h5pactivity</w:t>
+        <w:t>coursectrlmod_h5pactivity</w:t>
       </w:r>
     </w:p>
     <w:p>
@@ -517,7 +517,7 @@
       </w:r>
       <w:proofErr w:type="spellStart"/>
       <w:r>
-        <w:t>coursectrl_mod</w:t>
+        <w:t>coursectrlmod</w:t>
       </w:r>
       <w:proofErr w:type="spellEnd"/>
       <w:r>
@@ -1580,7 +1580,7 @@
     <w:p>
       <w:r>
         <w:pict w14:anchorId="79BDCB54">
-          <v:rect id="_x0000_i1158" style="width:0;height:1.5pt" o:hralign="center" o:hrstd="t" o:hr="t" fillcolor="#a0a0a0" stroked="f"/>
+          <v:rect id="_x0000_i1025" style="width:0;height:1.5pt" o:hralign="center" o:hrstd="t" o:hr="t" fillcolor="#a0a0a0" stroked="f"/>
         </w:pict>
       </w:r>
     </w:p>
@@ -1759,7 +1759,7 @@
     <w:p>
       <w:r>
         <w:pict w14:anchorId="012E42C4">
-          <v:rect id="_x0000_i1159" style="width:0;height:1.5pt" o:hralign="center" o:hrstd="t" o:hr="t" fillcolor="#a0a0a0" stroked="f"/>
+          <v:rect id="_x0000_i1026" style="width:0;height:1.5pt" o:hralign="center" o:hrstd="t" o:hr="t" fillcolor="#a0a0a0" stroked="f"/>
         </w:pict>
       </w:r>
     </w:p>
@@ -1858,7 +1858,7 @@
       </w:pPr>
       <w:proofErr w:type="spellStart"/>
       <w:r>
-        <w:t>coursectrl_mod</w:t>
+        <w:t>coursectrlmod</w:t>
       </w:r>
       <w:proofErr w:type="spellEnd"/>
       <w:r>
@@ -1988,7 +1988,7 @@
     <w:p>
       <w:r>
         <w:pict w14:anchorId="66C40662">
-          <v:rect id="_x0000_i1160" style="width:0;height:1.5pt" o:hralign="center" o:hrstd="t" o:hr="t" fillcolor="#a0a0a0" stroked="f"/>
+          <v:rect id="_x0000_i1027" style="width:0;height:1.5pt" o:hralign="center" o:hrstd="t" o:hr="t" fillcolor="#a0a0a0" stroked="f"/>
         </w:pict>
       </w:r>
     </w:p>
@@ -5182,6 +5182,11 @@
       </w:r>
     </w:p>
     <w:p>
+      <w:pPr>
+        <w:rPr>
+          <w:lang w:val="en-US"/>
+        </w:rPr>
+      </w:pPr>
       <w:r>
         <w:rPr>
           <w:lang w:val="en-US"/>
@@ -5189,17 +5194,42 @@
         <w:t xml:space="preserve">    </w:t>
       </w:r>
       <w:r>
+        <w:rPr>
+          <w:lang w:val="en-US"/>
+        </w:rPr>
         <w:t>history.js</w:t>
       </w:r>
     </w:p>
     <w:p>
-      <w:r>
+      <w:pPr>
+        <w:rPr>
+          <w:lang w:val="en-US"/>
+        </w:rPr>
+      </w:pPr>
+      <w:r>
+        <w:rPr>
+          <w:lang w:val="en-US"/>
+        </w:rPr>
         <w:t xml:space="preserve">    ajax.js</w:t>
       </w:r>
     </w:p>
-    <w:p/>
-    <w:p>
-      <w:r>
+    <w:p>
+      <w:pPr>
+        <w:rPr>
+          <w:lang w:val="en-US"/>
+        </w:rPr>
+      </w:pPr>
+    </w:p>
+    <w:p>
+      <w:pPr>
+        <w:rPr>
+          <w:lang w:val="en-US"/>
+        </w:rPr>
+      </w:pPr>
+      <w:r>
+        <w:rPr>
+          <w:lang w:val="en-US"/>
+        </w:rPr>
         <w:t xml:space="preserve">  lang/</w:t>
       </w:r>
     </w:p>
@@ -5210,6 +5240,9 @@
         </w:rPr>
       </w:pPr>
       <w:r>
+        <w:rPr>
+          <w:lang w:val="en-US"/>
+        </w:rPr>
         <w:t xml:space="preserve">    </w:t>
       </w:r>
       <w:r>
@@ -5431,7 +5464,7 @@
         <w:rPr>
           <w:lang w:val="en-US"/>
         </w:rPr>
-        <w:t>coursectrl_mod_assign.php</w:t>
+        <w:t>coursectrlmod_assign.php</w:t>
       </w:r>
       <w:proofErr w:type="spellEnd"/>
     </w:p>
@@ -5466,7 +5499,7 @@
         <w:rPr>
           <w:lang w:val="en-US"/>
         </w:rPr>
-        <w:t>coursectrl_mod_assign.php</w:t>
+        <w:t>coursectrlmod_assign.php</w:t>
       </w:r>
       <w:proofErr w:type="spellEnd"/>
     </w:p>
@@ -5625,7 +5658,7 @@
         <w:rPr>
           <w:lang w:val="en-US"/>
         </w:rPr>
-        <w:t>coursectrl_mod_quiz.php</w:t>
+        <w:t>coursectrlmod_quiz.php</w:t>
       </w:r>
       <w:proofErr w:type="spellEnd"/>
     </w:p>
@@ -5660,7 +5693,7 @@
         <w:rPr>
           <w:lang w:val="en-US"/>
         </w:rPr>
-        <w:t>coursectrl_mod_quiz.php</w:t>
+        <w:t>coursectrlmod_quiz.php</w:t>
       </w:r>
       <w:proofErr w:type="spellEnd"/>
     </w:p>
@@ -6716,7 +6749,7 @@
     <w:p>
       <w:r>
         <w:pict w14:anchorId="0935CBC0">
-          <v:rect id="_x0000_i1161" style="width:0;height:1.5pt" o:hralign="center" o:hrstd="t" o:hr="t" fillcolor="#a0a0a0" stroked="f"/>
+          <v:rect id="_x0000_i1028" style="width:0;height:1.5pt" o:hralign="center" o:hrstd="t" o:hr="t" fillcolor="#a0a0a0" stroked="f"/>
         </w:pict>
       </w:r>
     </w:p>
@@ -7705,7 +7738,7 @@
     <w:p>
       <w:r>
         <w:pict w14:anchorId="6FD64423">
-          <v:rect id="_x0000_i1162" style="width:0;height:1.5pt" o:hralign="center" o:hrstd="t" o:hr="t" fillcolor="#a0a0a0" stroked="f"/>
+          <v:rect id="_x0000_i1029" style="width:0;height:1.5pt" o:hralign="center" o:hrstd="t" o:hr="t" fillcolor="#a0a0a0" stroked="f"/>
         </w:pict>
       </w:r>
     </w:p>
@@ -8681,7 +8714,7 @@
     <w:p>
       <w:r>
         <w:pict w14:anchorId="0A00E62F">
-          <v:rect id="_x0000_i1163" style="width:0;height:1.5pt" o:hralign="center" o:hrstd="t" o:hr="t" fillcolor="#a0a0a0" stroked="f"/>
+          <v:rect id="_x0000_i1030" style="width:0;height:1.5pt" o:hralign="center" o:hrstd="t" o:hr="t" fillcolor="#a0a0a0" stroked="f"/>
         </w:pict>
       </w:r>
     </w:p>
@@ -8980,7 +9013,7 @@
     <w:p>
       <w:r>
         <w:pict w14:anchorId="5F8B491A">
-          <v:rect id="_x0000_i1164" style="width:0;height:1.5pt" o:hralign="center" o:hrstd="t" o:hr="t" fillcolor="#a0a0a0" stroked="f"/>
+          <v:rect id="_x0000_i1031" style="width:0;height:1.5pt" o:hralign="center" o:hrstd="t" o:hr="t" fillcolor="#a0a0a0" stroked="f"/>
         </w:pict>
       </w:r>
     </w:p>
@@ -9194,7 +9227,7 @@
     <w:p>
       <w:r>
         <w:pict w14:anchorId="7D8054D7">
-          <v:rect id="_x0000_i1165" style="width:0;height:1.5pt" o:hralign="center" o:hrstd="t" o:hr="t" fillcolor="#a0a0a0" stroked="f"/>
+          <v:rect id="_x0000_i1032" style="width:0;height:1.5pt" o:hralign="center" o:hrstd="t" o:hr="t" fillcolor="#a0a0a0" stroked="f"/>
         </w:pict>
       </w:r>
     </w:p>
@@ -9454,7 +9487,7 @@
     <w:p>
       <w:r>
         <w:pict w14:anchorId="3F43B99C">
-          <v:rect id="_x0000_i1166" style="width:0;height:1.5pt" o:hralign="center" o:hrstd="t" o:hr="t" fillcolor="#a0a0a0" stroked="f"/>
+          <v:rect id="_x0000_i1033" style="width:0;height:1.5pt" o:hralign="center" o:hrstd="t" o:hr="t" fillcolor="#a0a0a0" stroked="f"/>
         </w:pict>
       </w:r>
     </w:p>
@@ -9672,7 +9705,7 @@
     <w:p>
       <w:r>
         <w:pict w14:anchorId="2434791B">
-          <v:rect id="_x0000_i1167" style="width:0;height:1.5pt" o:hralign="center" o:hrstd="t" o:hr="t" fillcolor="#a0a0a0" stroked="f"/>
+          <v:rect id="_x0000_i1034" style="width:0;height:1.5pt" o:hralign="center" o:hrstd="t" o:hr="t" fillcolor="#a0a0a0" stroked="f"/>
         </w:pict>
       </w:r>
     </w:p>
@@ -9742,7 +9775,7 @@
       </w:pPr>
       <w:proofErr w:type="spellStart"/>
       <w:r>
-        <w:t>coursectrl_mod_assign</w:t>
+        <w:t>coursectrlmod_assign</w:t>
       </w:r>
       <w:proofErr w:type="spellEnd"/>
       <w:r>
@@ -9758,7 +9791,7 @@
       </w:pPr>
       <w:proofErr w:type="spellStart"/>
       <w:r>
-        <w:t>coursectrl_mod_quiz</w:t>
+        <w:t>coursectrlmod_quiz</w:t>
       </w:r>
       <w:proofErr w:type="spellEnd"/>
       <w:r>
@@ -9774,7 +9807,7 @@
       </w:pPr>
       <w:proofErr w:type="spellStart"/>
       <w:r>
-        <w:t>coursectrl_mod_feedback</w:t>
+        <w:t>coursectrlmod_feedback</w:t>
       </w:r>
       <w:proofErr w:type="spellEnd"/>
       <w:r>
@@ -9894,7 +9927,7 @@
     <w:p>
       <w:r>
         <w:pict w14:anchorId="0C16B5B6">
-          <v:rect id="_x0000_i1168" style="width:0;height:1.5pt" o:hralign="center" o:hrstd="t" o:hr="t" fillcolor="#a0a0a0" stroked="f"/>
+          <v:rect id="_x0000_i1035" style="width:0;height:1.5pt" o:hralign="center" o:hrstd="t" o:hr="t" fillcolor="#a0a0a0" stroked="f"/>
         </w:pict>
       </w:r>
     </w:p>
@@ -10133,7 +10166,7 @@
     <w:p>
       <w:r>
         <w:pict w14:anchorId="5E45C3BC">
-          <v:rect id="_x0000_i1169" style="width:0;height:1.5pt" o:hralign="center" o:hrstd="t" o:hr="t" fillcolor="#a0a0a0" stroked="f"/>
+          <v:rect id="_x0000_i1036" style="width:0;height:1.5pt" o:hralign="center" o:hrstd="t" o:hr="t" fillcolor="#a0a0a0" stroked="f"/>
         </w:pict>
       </w:r>
     </w:p>
@@ -10356,7 +10389,7 @@
       <w:r>
         <w:lastRenderedPageBreak/>
         <w:pict w14:anchorId="3572DB1D">
-          <v:rect id="_x0000_i1170" style="width:0;height:1.5pt" o:hralign="center" o:hrstd="t" o:hr="t" fillcolor="#a0a0a0" stroked="f"/>
+          <v:rect id="_x0000_i1037" style="width:0;height:1.5pt" o:hralign="center" o:hrstd="t" o:hr="t" fillcolor="#a0a0a0" stroked="f"/>
         </w:pict>
       </w:r>
     </w:p>
@@ -10568,7 +10601,7 @@
     <w:p>
       <w:r>
         <w:pict w14:anchorId="124CBCE2">
-          <v:rect id="_x0000_i1171" style="width:0;height:1.5pt" o:hralign="center" o:hrstd="t" o:hr="t" fillcolor="#a0a0a0" stroked="f"/>
+          <v:rect id="_x0000_i1038" style="width:0;height:1.5pt" o:hralign="center" o:hrstd="t" o:hr="t" fillcolor="#a0a0a0" stroked="f"/>
         </w:pict>
       </w:r>
     </w:p>
@@ -10809,7 +10842,7 @@
     <w:p>
       <w:r>
         <w:pict w14:anchorId="24F6D94F">
-          <v:rect id="_x0000_i1172" style="width:0;height:1.5pt" o:hralign="center" o:hrstd="t" o:hr="t" fillcolor="#a0a0a0" stroked="f"/>
+          <v:rect id="_x0000_i1039" style="width:0;height:1.5pt" o:hralign="center" o:hrstd="t" o:hr="t" fillcolor="#a0a0a0" stroked="f"/>
         </w:pict>
       </w:r>
     </w:p>
@@ -11044,7 +11077,7 @@
     <w:p>
       <w:r>
         <w:pict w14:anchorId="2CFB6FCF">
-          <v:rect id="_x0000_i1173" style="width:0;height:1.5pt" o:hralign="center" o:hrstd="t" o:hr="t" fillcolor="#a0a0a0" stroked="f"/>
+          <v:rect id="_x0000_i1040" style="width:0;height:1.5pt" o:hralign="center" o:hrstd="t" o:hr="t" fillcolor="#a0a0a0" stroked="f"/>
         </w:pict>
       </w:r>
     </w:p>
@@ -11268,7 +11301,7 @@
     <w:p>
       <w:r>
         <w:pict w14:anchorId="44FD364F">
-          <v:rect id="_x0000_i1174" style="width:0;height:1.5pt" o:hralign="center" o:hrstd="t" o:hr="t" fillcolor="#a0a0a0" stroked="f"/>
+          <v:rect id="_x0000_i1041" style="width:0;height:1.5pt" o:hralign="center" o:hrstd="t" o:hr="t" fillcolor="#a0a0a0" stroked="f"/>
         </w:pict>
       </w:r>
     </w:p>
@@ -11518,7 +11551,7 @@
     <w:p>
       <w:r>
         <w:pict w14:anchorId="411953EF">
-          <v:rect id="_x0000_i1175" style="width:0;height:1.5pt" o:hralign="center" o:hrstd="t" o:hr="t" fillcolor="#a0a0a0" stroked="f"/>
+          <v:rect id="_x0000_i1042" style="width:0;height:1.5pt" o:hralign="center" o:hrstd="t" o:hr="t" fillcolor="#a0a0a0" stroked="f"/>
         </w:pict>
       </w:r>
     </w:p>
@@ -20458,6 +20491,7 @@
   <w:style w:type="character" w:default="1" w:styleId="Absatz-Standardschriftart">
     <w:name w:val="Default Paragraph Font"/>
     <w:uiPriority w:val="1"/>
+    <w:semiHidden/>
     <w:unhideWhenUsed/>
   </w:style>
   <w:style w:type="table" w:default="1" w:styleId="NormaleTabelle">

</xml_diff>